<commit_message>
Add constructive emergence witness and revised preprint with restricted test boundary
</commit_message>
<xml_diff>
--- a/papers/universal-reclosure-emergence-2026-09-29/BFG_Universal_Reclosure_and_Emergence_Preprint_2026-09-29.docx
+++ b/papers/universal-reclosure-emergence-2026-09-29/BFG_Universal_Reclosure_and_Emergence_Preprint_2026-09-29.docx
@@ -102,7 +102,7 @@
     </w:p>
     <w:p>
       <w:r>
-        <w:t>We connect the generator-level BFG grammar of formation, bounded non-vanishing persistence, and relational reclosure to its finite five-object successor representation. A neutral-compatible stratum admits an exact inheritance–novelty identity: commutation of inherited formation with neutral load is equivalent to unchanged formation, while noncommutation produces strict loss of the second spectral moment. This result witnesses internal structural novelty, not automatically an irreducible higher closure. We formalize the latter by source continuity, recursive higher closure, a generative removal intervention, and a prespecified class of mechanistically different rivals. A representation theorem shows that an invertible recoding of a hidden mediator is observationally indistinguishable from the original dynamics; requiring a model to beat its exact clone is therefore impossible. A constructed pilot gives a positive mediator-versus-removal contrast, but a direct dyad performs better and an exact clone ties. We provide a corrected prospective test rule and state the resulting boundary: BFG has a coherent universal closure and emergence criterion, while universal existence and carrier-specific irreducibility remain unproved.</w:t>
+        <w:t>We connect the generator-level BFG grammar of formation, bounded non-vanishing persistence, and relational reclosure to its finite five-object successor representation. A neutral-compatible stratum admits an exact inheritance–novelty identity: commutation of inherited formation with neutral load is equivalent to unchanged formation, while noncommutation produces strict loss of the second spectral moment. This witnesses internal structural novelty, not automatically an irreducible higher closure. We formalize the latter by source continuity, recursive higher closure, generative removal, and specified mechanistic rivals. A representation theorem shows that invertible recoding of a hidden mediator gives identical observed paths. An earlier constructed pilot has a positive removal effect but is outperformed by a direct dyad. We additionally construct a two-stage synthetic example with persistent sources, a separately updated higher state, successful edge removal and restoration, and an exact temporal signature separating declared one-pole and additive rivals. A two-state recoding remains equivalent. Thus a restricted synthetic witness exists, while universal existence, unique mediation, canonical-map realization, and natural-carrier irreducibility remain unproved.</w:t>
       </w:r>
     </w:p>
     <w:p>
@@ -495,7 +495,7 @@
                 <w:rFonts w:ascii="Cambria" w:hAnsi="Cambria"/>
                 <w:sz w:val="17"/>
               </w:rPr>
-              <w:t>Synthetic pilot</w:t>
+              <w:t>Synthetic tests</w:t>
             </w:r>
           </w:p>
         </w:tc>
@@ -528,7 +528,7 @@
                 <w:rFonts w:ascii="Cambria" w:hAnsi="Cambria"/>
                 <w:sz w:val="17"/>
               </w:rPr>
-              <w:t>Compares constructed trajectories and controls.</w:t>
+              <w:t>Compare declared constructed generators and controls.</w:t>
             </w:r>
           </w:p>
         </w:tc>
@@ -561,7 +561,7 @@
                 <w:rFonts w:ascii="Cambria" w:hAnsi="Cambria"/>
                 <w:sz w:val="17"/>
               </w:rPr>
-              <w:t>Does not establish natural realization.</w:t>
+              <w:t>Do not establish natural or canonical-map realization.</w:t>
             </w:r>
           </w:p>
         </w:tc>
@@ -2399,7 +2399,587 @@
         <w:pStyle w:val="Heading1"/>
       </w:pPr>
       <w:r>
-        <w:t>11. Formal completion and outstanding claims</w:t>
+        <w:t>11. A constructive synthetic witness with restricted rivals</w:t>
+      </w:r>
+    </w:p>
+    <w:p>
+      <w:r>
+        <w:t>After the preceding pilot, we designed a second, deliberately constructed generator with a fixed protocol and executable code [12]. Its favorable result is an existence example relative to a declared restricted rival class, not an independent preregistered test of a theory. Let s₁,ₜ and s₂,ₜ be independently driven signs of amplitude one. Define qₜ=1+0.5s₁,ₜs₂,ₜ and evolve distinct mediator and higher states:</w:t>
+      </w:r>
+    </w:p>
+    <w:p>
+      <w:pPr>
+        <w:pStyle w:val="Equation"/>
+      </w:pPr>
+      <w:r>
+        <w:t>mₜ₊₁=0.6mₜ+0.4qₜ,     hₜ₊₁=0.4hₜ+0.6γmₜ,     m₀=h₀=1.</w:t>
+      </w:r>
+      <w:r>
+        <w:tab/>
+        <w:t>(19)</w:t>
+      </w:r>
+    </w:p>
+    <w:p>
+      <w:r>
+        <w:t>For γ=1, the convex updates keep m and the unperturbed h within [0.5,1.5], while both sources remain active. At step 80, an equal external perturbation resets h to zero in all arms. Setting γ=0 for 30 steps removes the m→h generating edge, without changing sources or mediator. Returning γ to one at step 110 restores the higher state. The prespecified score is the mean h over the final ten steps of each comparison window. In 1,000 matched 160-step sequences, the smallest full-minus-removed score at steps 100–109 was 0.550554 and the smallest restored-minus-continuously-removed score at steps 120–129 was 0.563750. Both exceed the fixed threshold 0.49; all source gates passed. These inequalities also follow from positivity and the contraction factors, so the simulated repetitions illustrate rather than establish the result.</w:t>
+      </w:r>
+    </w:p>
+    <w:p>
+      <w:r>
+        <w:t>The same-time mixed contrast q(+,+)−q(+,-)−q(-,+)+q(-,-)=2 excludes the defined additive or interaction-free common-driver controls under independently controlled source assignments. A single-time circular-shift control with shifted history fixed has zero such contrast. The unit impulse response from qₜ to hₜ₊ₖ is (g₁,g₂,g₃,g₄)=(0,0.24,0.24,0.1824), with g₂g₄−g₃²=−0.013824. A direct dyad in the specified one-pole class hₜ₊₁=λhₜ+cqₜ₋₁ has a zero determinant and cannot match all four lags. Its threshold was |determinant|&gt;0.01. An unrestricted direct model with two driven states can reproduce the full trajectory by recoding m and h; this is a representation-equivalence tie, not a defeated rival.</w:t>
+      </w:r>
+    </w:p>
+    <w:p>
+      <w:pPr>
+        <w:pStyle w:val="CaptionBFG"/>
+      </w:pPr>
+      <w:r>
+        <w:t>Table 4. Fixed constructive test and logical reach.</w:t>
+      </w:r>
+    </w:p>
+    <w:tbl>
+      <w:tblPr>
+        <w:tblW w:type="auto" w:w="0"/>
+        <w:jc w:val="center"/>
+        <w:tblLayout w:type="fixed"/>
+        <w:tblLook w:firstColumn="1" w:firstRow="1" w:lastColumn="0" w:lastRow="0" w:noHBand="0" w:noVBand="1" w:val="04A0"/>
+      </w:tblPr>
+      <w:tblGrid>
+        <w:gridCol w:w="3216"/>
+        <w:gridCol w:w="3216"/>
+        <w:gridCol w:w="3216"/>
+      </w:tblGrid>
+      <w:tr>
+        <w:trPr>
+          <w:tblHeader w:val="true"/>
+        </w:trPr>
+        <w:tc>
+          <w:tcPr>
+            <w:tcW w:type="dxa" w:w="2880"/>
+            <w:vAlign w:val="center"/>
+            <w:shd w:fill="273A4B"/>
+            <w:tcMar>
+              <w:top w:w="95" w:type="dxa"/>
+              <w:left w:w="95" w:type="dxa"/>
+              <w:bottom w:w="95" w:type="dxa"/>
+              <w:right w:w="95" w:type="dxa"/>
+            </w:tcMar>
+            <w:tcBorders>
+              <w:top w:val="single" w:sz="4" w:color="D9D9D9"/>
+              <w:left w:val="single" w:sz="4" w:color="D9D9D9"/>
+              <w:bottom w:val="single" w:sz="4" w:color="D9D9D9"/>
+              <w:right w:val="single" w:sz="4" w:color="D9D9D9"/>
+              <w:insideH w:val="single" w:sz="4" w:color="D9D9D9"/>
+              <w:insideV w:val="single" w:sz="4" w:color="D9D9D9"/>
+            </w:tcBorders>
+          </w:tcPr>
+          <w:p>
+            <w:pPr>
+              <w:spacing w:after="0" w:line="269" w:lineRule="auto"/>
+            </w:pPr>
+            <w:r>
+              <w:rPr>
+                <w:rFonts w:ascii="Cambria" w:hAnsi="Cambria"/>
+                <w:b/>
+                <w:color w:val="FFFFFF"/>
+                <w:sz w:val="17"/>
+              </w:rPr>
+              <w:t>Gate</w:t>
+            </w:r>
+          </w:p>
+        </w:tc>
+        <w:tc>
+          <w:tcPr>
+            <w:tcW w:type="dxa" w:w="3528"/>
+            <w:vAlign w:val="center"/>
+            <w:shd w:fill="273A4B"/>
+            <w:tcMar>
+              <w:top w:w="95" w:type="dxa"/>
+              <w:left w:w="95" w:type="dxa"/>
+              <w:bottom w:w="95" w:type="dxa"/>
+              <w:right w:w="95" w:type="dxa"/>
+            </w:tcMar>
+            <w:tcBorders>
+              <w:top w:val="single" w:sz="4" w:color="D9D9D9"/>
+              <w:left w:val="single" w:sz="4" w:color="D9D9D9"/>
+              <w:bottom w:val="single" w:sz="4" w:color="D9D9D9"/>
+              <w:right w:val="single" w:sz="4" w:color="D9D9D9"/>
+              <w:insideH w:val="single" w:sz="4" w:color="D9D9D9"/>
+              <w:insideV w:val="single" w:sz="4" w:color="D9D9D9"/>
+            </w:tcBorders>
+          </w:tcPr>
+          <w:p>
+            <w:pPr>
+              <w:spacing w:after="0" w:line="269" w:lineRule="auto"/>
+            </w:pPr>
+            <w:r>
+              <w:rPr>
+                <w:rFonts w:ascii="Cambria" w:hAnsi="Cambria"/>
+                <w:b/>
+                <w:color w:val="FFFFFF"/>
+                <w:sz w:val="17"/>
+              </w:rPr>
+              <w:t>Result</w:t>
+            </w:r>
+          </w:p>
+        </w:tc>
+        <w:tc>
+          <w:tcPr>
+            <w:tcW w:type="dxa" w:w="3384"/>
+            <w:vAlign w:val="center"/>
+            <w:shd w:fill="273A4B"/>
+            <w:tcMar>
+              <w:top w:w="95" w:type="dxa"/>
+              <w:left w:w="95" w:type="dxa"/>
+              <w:bottom w:w="95" w:type="dxa"/>
+              <w:right w:w="95" w:type="dxa"/>
+            </w:tcMar>
+            <w:tcBorders>
+              <w:top w:val="single" w:sz="4" w:color="D9D9D9"/>
+              <w:left w:val="single" w:sz="4" w:color="D9D9D9"/>
+              <w:bottom w:val="single" w:sz="4" w:color="D9D9D9"/>
+              <w:right w:val="single" w:sz="4" w:color="D9D9D9"/>
+              <w:insideH w:val="single" w:sz="4" w:color="D9D9D9"/>
+              <w:insideV w:val="single" w:sz="4" w:color="D9D9D9"/>
+            </w:tcBorders>
+          </w:tcPr>
+          <w:p>
+            <w:pPr>
+              <w:spacing w:after="0" w:line="269" w:lineRule="auto"/>
+            </w:pPr>
+            <w:r>
+              <w:rPr>
+                <w:rFonts w:ascii="Cambria" w:hAnsi="Cambria"/>
+                <w:b/>
+                <w:color w:val="FFFFFF"/>
+                <w:sz w:val="17"/>
+              </w:rPr>
+              <w:t>Scope</w:t>
+            </w:r>
+          </w:p>
+        </w:tc>
+      </w:tr>
+      <w:tr>
+        <w:tc>
+          <w:tcPr>
+            <w:tcW w:type="dxa" w:w="2880"/>
+            <w:vAlign w:val="center"/>
+            <w:shd w:fill="FFFFFF"/>
+            <w:tcMar>
+              <w:top w:w="95" w:type="dxa"/>
+              <w:left w:w="95" w:type="dxa"/>
+              <w:bottom w:w="95" w:type="dxa"/>
+              <w:right w:w="95" w:type="dxa"/>
+            </w:tcMar>
+            <w:tcBorders>
+              <w:top w:val="single" w:sz="4" w:color="D9D9D9"/>
+              <w:left w:val="single" w:sz="4" w:color="D9D9D9"/>
+              <w:bottom w:val="single" w:sz="4" w:color="D9D9D9"/>
+              <w:right w:val="single" w:sz="4" w:color="D9D9D9"/>
+              <w:insideH w:val="single" w:sz="4" w:color="D9D9D9"/>
+              <w:insideV w:val="single" w:sz="4" w:color="D9D9D9"/>
+            </w:tcBorders>
+          </w:tcPr>
+          <w:p>
+            <w:pPr>
+              <w:spacing w:after="0" w:line="269" w:lineRule="auto"/>
+            </w:pPr>
+            <w:r>
+              <w:rPr>
+                <w:rFonts w:ascii="Cambria" w:hAnsi="Cambria"/>
+                <w:sz w:val="17"/>
+              </w:rPr>
+              <w:t>Source and higher persistence</w:t>
+            </w:r>
+          </w:p>
+        </w:tc>
+        <w:tc>
+          <w:tcPr>
+            <w:tcW w:type="dxa" w:w="3528"/>
+            <w:vAlign w:val="center"/>
+            <w:shd w:fill="FFFFFF"/>
+            <w:tcMar>
+              <w:top w:w="95" w:type="dxa"/>
+              <w:left w:w="95" w:type="dxa"/>
+              <w:bottom w:w="95" w:type="dxa"/>
+              <w:right w:w="95" w:type="dxa"/>
+            </w:tcMar>
+            <w:tcBorders>
+              <w:top w:val="single" w:sz="4" w:color="D9D9D9"/>
+              <w:left w:val="single" w:sz="4" w:color="D9D9D9"/>
+              <w:bottom w:val="single" w:sz="4" w:color="D9D9D9"/>
+              <w:right w:val="single" w:sz="4" w:color="D9D9D9"/>
+              <w:insideH w:val="single" w:sz="4" w:color="D9D9D9"/>
+              <w:insideV w:val="single" w:sz="4" w:color="D9D9D9"/>
+            </w:tcBorders>
+          </w:tcPr>
+          <w:p>
+            <w:pPr>
+              <w:spacing w:after="0" w:line="269" w:lineRule="auto"/>
+            </w:pPr>
+            <w:r>
+              <w:rPr>
+                <w:rFonts w:ascii="Cambria" w:hAnsi="Cambria"/>
+                <w:sz w:val="17"/>
+              </w:rPr>
+              <w:t>1,000/1,000 source gates; full steady h in [0.50023,1.49982].</w:t>
+            </w:r>
+          </w:p>
+        </w:tc>
+        <w:tc>
+          <w:tcPr>
+            <w:tcW w:type="dxa" w:w="3384"/>
+            <w:vAlign w:val="center"/>
+            <w:shd w:fill="FFFFFF"/>
+            <w:tcMar>
+              <w:top w:w="95" w:type="dxa"/>
+              <w:left w:w="95" w:type="dxa"/>
+              <w:bottom w:w="95" w:type="dxa"/>
+              <w:right w:w="95" w:type="dxa"/>
+            </w:tcMar>
+            <w:tcBorders>
+              <w:top w:val="single" w:sz="4" w:color="D9D9D9"/>
+              <w:left w:val="single" w:sz="4" w:color="D9D9D9"/>
+              <w:bottom w:val="single" w:sz="4" w:color="D9D9D9"/>
+              <w:right w:val="single" w:sz="4" w:color="D9D9D9"/>
+              <w:insideH w:val="single" w:sz="4" w:color="D9D9D9"/>
+              <w:insideV w:val="single" w:sz="4" w:color="D9D9D9"/>
+            </w:tcBorders>
+          </w:tcPr>
+          <w:p>
+            <w:pPr>
+              <w:spacing w:after="0" w:line="269" w:lineRule="auto"/>
+            </w:pPr>
+            <w:r>
+              <w:rPr>
+                <w:rFonts w:ascii="Cambria" w:hAnsi="Cambria"/>
+                <w:sz w:val="17"/>
+              </w:rPr>
+              <w:t>Stipulated signed sources and convex update.</w:t>
+            </w:r>
+          </w:p>
+        </w:tc>
+      </w:tr>
+      <w:tr>
+        <w:tc>
+          <w:tcPr>
+            <w:tcW w:type="dxa" w:w="2880"/>
+            <w:vAlign w:val="center"/>
+            <w:shd w:fill="F5F7F9"/>
+            <w:tcMar>
+              <w:top w:w="95" w:type="dxa"/>
+              <w:left w:w="95" w:type="dxa"/>
+              <w:bottom w:w="95" w:type="dxa"/>
+              <w:right w:w="95" w:type="dxa"/>
+            </w:tcMar>
+            <w:tcBorders>
+              <w:top w:val="single" w:sz="4" w:color="D9D9D9"/>
+              <w:left w:val="single" w:sz="4" w:color="D9D9D9"/>
+              <w:bottom w:val="single" w:sz="4" w:color="D9D9D9"/>
+              <w:right w:val="single" w:sz="4" w:color="D9D9D9"/>
+              <w:insideH w:val="single" w:sz="4" w:color="D9D9D9"/>
+              <w:insideV w:val="single" w:sz="4" w:color="D9D9D9"/>
+            </w:tcBorders>
+          </w:tcPr>
+          <w:p>
+            <w:pPr>
+              <w:spacing w:after="0" w:line="269" w:lineRule="auto"/>
+            </w:pPr>
+            <w:r>
+              <w:rPr>
+                <w:rFonts w:ascii="Cambria" w:hAnsi="Cambria"/>
+                <w:sz w:val="17"/>
+              </w:rPr>
+              <w:t>Removal and restoration</w:t>
+            </w:r>
+          </w:p>
+        </w:tc>
+        <w:tc>
+          <w:tcPr>
+            <w:tcW w:type="dxa" w:w="3528"/>
+            <w:vAlign w:val="center"/>
+            <w:shd w:fill="F5F7F9"/>
+            <w:tcMar>
+              <w:top w:w="95" w:type="dxa"/>
+              <w:left w:w="95" w:type="dxa"/>
+              <w:bottom w:w="95" w:type="dxa"/>
+              <w:right w:w="95" w:type="dxa"/>
+            </w:tcMar>
+            <w:tcBorders>
+              <w:top w:val="single" w:sz="4" w:color="D9D9D9"/>
+              <w:left w:val="single" w:sz="4" w:color="D9D9D9"/>
+              <w:bottom w:val="single" w:sz="4" w:color="D9D9D9"/>
+              <w:right w:val="single" w:sz="4" w:color="D9D9D9"/>
+              <w:insideH w:val="single" w:sz="4" w:color="D9D9D9"/>
+              <w:insideV w:val="single" w:sz="4" w:color="D9D9D9"/>
+            </w:tcBorders>
+          </w:tcPr>
+          <w:p>
+            <w:pPr>
+              <w:spacing w:after="0" w:line="269" w:lineRule="auto"/>
+            </w:pPr>
+            <w:r>
+              <w:rPr>
+                <w:rFonts w:ascii="Cambria" w:hAnsi="Cambria"/>
+                <w:sz w:val="17"/>
+              </w:rPr>
+              <w:t>Minimum contrasts 0.55055 and 0.56375; threshold 0.49.</w:t>
+            </w:r>
+          </w:p>
+        </w:tc>
+        <w:tc>
+          <w:tcPr>
+            <w:tcW w:type="dxa" w:w="3384"/>
+            <w:vAlign w:val="center"/>
+            <w:shd w:fill="F5F7F9"/>
+            <w:tcMar>
+              <w:top w:w="95" w:type="dxa"/>
+              <w:left w:w="95" w:type="dxa"/>
+              <w:bottom w:w="95" w:type="dxa"/>
+              <w:right w:w="95" w:type="dxa"/>
+            </w:tcMar>
+            <w:tcBorders>
+              <w:top w:val="single" w:sz="4" w:color="D9D9D9"/>
+              <w:left w:val="single" w:sz="4" w:color="D9D9D9"/>
+              <w:bottom w:val="single" w:sz="4" w:color="D9D9D9"/>
+              <w:right w:val="single" w:sz="4" w:color="D9D9D9"/>
+              <w:insideH w:val="single" w:sz="4" w:color="D9D9D9"/>
+              <w:insideV w:val="single" w:sz="4" w:color="D9D9D9"/>
+            </w:tcBorders>
+          </w:tcPr>
+          <w:p>
+            <w:pPr>
+              <w:spacing w:after="0" w:line="269" w:lineRule="auto"/>
+            </w:pPr>
+            <w:r>
+              <w:rPr>
+                <w:rFonts w:ascii="Cambria" w:hAnsi="Cambria"/>
+                <w:sz w:val="17"/>
+              </w:rPr>
+              <w:t>Causal necessity within this generator.</w:t>
+            </w:r>
+          </w:p>
+        </w:tc>
+      </w:tr>
+      <w:tr>
+        <w:tc>
+          <w:tcPr>
+            <w:tcW w:type="dxa" w:w="2880"/>
+            <w:vAlign w:val="center"/>
+            <w:shd w:fill="FFFFFF"/>
+            <w:tcMar>
+              <w:top w:w="95" w:type="dxa"/>
+              <w:left w:w="95" w:type="dxa"/>
+              <w:bottom w:w="95" w:type="dxa"/>
+              <w:right w:w="95" w:type="dxa"/>
+            </w:tcMar>
+            <w:tcBorders>
+              <w:top w:val="single" w:sz="4" w:color="D9D9D9"/>
+              <w:left w:val="single" w:sz="4" w:color="D9D9D9"/>
+              <w:bottom w:val="single" w:sz="4" w:color="D9D9D9"/>
+              <w:right w:val="single" w:sz="4" w:color="D9D9D9"/>
+              <w:insideH w:val="single" w:sz="4" w:color="D9D9D9"/>
+              <w:insideV w:val="single" w:sz="4" w:color="D9D9D9"/>
+            </w:tcBorders>
+          </w:tcPr>
+          <w:p>
+            <w:pPr>
+              <w:spacing w:after="0" w:line="269" w:lineRule="auto"/>
+            </w:pPr>
+            <w:r>
+              <w:rPr>
+                <w:rFonts w:ascii="Cambria" w:hAnsi="Cambria"/>
+                <w:sz w:val="17"/>
+              </w:rPr>
+              <w:t>Restricted rivals</w:t>
+            </w:r>
+          </w:p>
+        </w:tc>
+        <w:tc>
+          <w:tcPr>
+            <w:tcW w:type="dxa" w:w="3528"/>
+            <w:vAlign w:val="center"/>
+            <w:shd w:fill="FFFFFF"/>
+            <w:tcMar>
+              <w:top w:w="95" w:type="dxa"/>
+              <w:left w:w="95" w:type="dxa"/>
+              <w:bottom w:w="95" w:type="dxa"/>
+              <w:right w:w="95" w:type="dxa"/>
+            </w:tcMar>
+            <w:tcBorders>
+              <w:top w:val="single" w:sz="4" w:color="D9D9D9"/>
+              <w:left w:val="single" w:sz="4" w:color="D9D9D9"/>
+              <w:bottom w:val="single" w:sz="4" w:color="D9D9D9"/>
+              <w:right w:val="single" w:sz="4" w:color="D9D9D9"/>
+              <w:insideH w:val="single" w:sz="4" w:color="D9D9D9"/>
+              <w:insideV w:val="single" w:sz="4" w:color="D9D9D9"/>
+            </w:tcBorders>
+          </w:tcPr>
+          <w:p>
+            <w:pPr>
+              <w:spacing w:after="0" w:line="269" w:lineRule="auto"/>
+            </w:pPr>
+            <w:r>
+              <w:rPr>
+                <w:rFonts w:ascii="Cambria" w:hAnsi="Cambria"/>
+                <w:sz w:val="17"/>
+              </w:rPr>
+              <w:t>Mixed contrast 2; temporal determinant −0.013824.</w:t>
+            </w:r>
+          </w:p>
+        </w:tc>
+        <w:tc>
+          <w:tcPr>
+            <w:tcW w:type="dxa" w:w="3384"/>
+            <w:vAlign w:val="center"/>
+            <w:shd w:fill="FFFFFF"/>
+            <w:tcMar>
+              <w:top w:w="95" w:type="dxa"/>
+              <w:left w:w="95" w:type="dxa"/>
+              <w:bottom w:w="95" w:type="dxa"/>
+              <w:right w:w="95" w:type="dxa"/>
+            </w:tcMar>
+            <w:tcBorders>
+              <w:top w:val="single" w:sz="4" w:color="D9D9D9"/>
+              <w:left w:val="single" w:sz="4" w:color="D9D9D9"/>
+              <w:bottom w:val="single" w:sz="4" w:color="D9D9D9"/>
+              <w:right w:val="single" w:sz="4" w:color="D9D9D9"/>
+              <w:insideH w:val="single" w:sz="4" w:color="D9D9D9"/>
+              <w:insideV w:val="single" w:sz="4" w:color="D9D9D9"/>
+            </w:tcBorders>
+          </w:tcPr>
+          <w:p>
+            <w:pPr>
+              <w:spacing w:after="0" w:line="269" w:lineRule="auto"/>
+            </w:pPr>
+            <w:r>
+              <w:rPr>
+                <w:rFonts w:ascii="Cambria" w:hAnsi="Cambria"/>
+                <w:sz w:val="17"/>
+              </w:rPr>
+              <w:t>Excludes specified additive and one-pole forms only.</w:t>
+            </w:r>
+          </w:p>
+        </w:tc>
+      </w:tr>
+      <w:tr>
+        <w:tc>
+          <w:tcPr>
+            <w:tcW w:type="dxa" w:w="2880"/>
+            <w:vAlign w:val="center"/>
+            <w:shd w:fill="F5F7F9"/>
+            <w:tcMar>
+              <w:top w:w="95" w:type="dxa"/>
+              <w:left w:w="95" w:type="dxa"/>
+              <w:bottom w:w="95" w:type="dxa"/>
+              <w:right w:w="95" w:type="dxa"/>
+            </w:tcMar>
+            <w:tcBorders>
+              <w:top w:val="single" w:sz="4" w:color="D9D9D9"/>
+              <w:left w:val="single" w:sz="4" w:color="D9D9D9"/>
+              <w:bottom w:val="single" w:sz="4" w:color="D9D9D9"/>
+              <w:right w:val="single" w:sz="4" w:color="D9D9D9"/>
+              <w:insideH w:val="single" w:sz="4" w:color="D9D9D9"/>
+              <w:insideV w:val="single" w:sz="4" w:color="D9D9D9"/>
+            </w:tcBorders>
+          </w:tcPr>
+          <w:p>
+            <w:pPr>
+              <w:spacing w:after="0" w:line="269" w:lineRule="auto"/>
+            </w:pPr>
+            <w:r>
+              <w:rPr>
+                <w:rFonts w:ascii="Cambria" w:hAnsi="Cambria"/>
+                <w:sz w:val="17"/>
+              </w:rPr>
+              <w:t>Two-state clone</w:t>
+            </w:r>
+          </w:p>
+        </w:tc>
+        <w:tc>
+          <w:tcPr>
+            <w:tcW w:type="dxa" w:w="3528"/>
+            <w:vAlign w:val="center"/>
+            <w:shd w:fill="F5F7F9"/>
+            <w:tcMar>
+              <w:top w:w="95" w:type="dxa"/>
+              <w:left w:w="95" w:type="dxa"/>
+              <w:bottom w:w="95" w:type="dxa"/>
+              <w:right w:w="95" w:type="dxa"/>
+            </w:tcMar>
+            <w:tcBorders>
+              <w:top w:val="single" w:sz="4" w:color="D9D9D9"/>
+              <w:left w:val="single" w:sz="4" w:color="D9D9D9"/>
+              <w:bottom w:val="single" w:sz="4" w:color="D9D9D9"/>
+              <w:right w:val="single" w:sz="4" w:color="D9D9D9"/>
+              <w:insideH w:val="single" w:sz="4" w:color="D9D9D9"/>
+              <w:insideV w:val="single" w:sz="4" w:color="D9D9D9"/>
+            </w:tcBorders>
+          </w:tcPr>
+          <w:p>
+            <w:pPr>
+              <w:spacing w:after="0" w:line="269" w:lineRule="auto"/>
+            </w:pPr>
+            <w:r>
+              <w:rPr>
+                <w:rFonts w:ascii="Cambria" w:hAnsi="Cambria"/>
+                <w:sz w:val="17"/>
+              </w:rPr>
+              <w:t>Exact representational tie.</w:t>
+            </w:r>
+          </w:p>
+        </w:tc>
+        <w:tc>
+          <w:tcPr>
+            <w:tcW w:type="dxa" w:w="3384"/>
+            <w:vAlign w:val="center"/>
+            <w:shd w:fill="F5F7F9"/>
+            <w:tcMar>
+              <w:top w:w="95" w:type="dxa"/>
+              <w:left w:w="95" w:type="dxa"/>
+              <w:bottom w:w="95" w:type="dxa"/>
+              <w:right w:w="95" w:type="dxa"/>
+            </w:tcMar>
+            <w:tcBorders>
+              <w:top w:val="single" w:sz="4" w:color="D9D9D9"/>
+              <w:left w:val="single" w:sz="4" w:color="D9D9D9"/>
+              <w:bottom w:val="single" w:sz="4" w:color="D9D9D9"/>
+              <w:right w:val="single" w:sz="4" w:color="D9D9D9"/>
+              <w:insideH w:val="single" w:sz="4" w:color="D9D9D9"/>
+              <w:insideV w:val="single" w:sz="4" w:color="D9D9D9"/>
+            </w:tcBorders>
+          </w:tcPr>
+          <w:p>
+            <w:pPr>
+              <w:spacing w:after="0" w:line="269" w:lineRule="auto"/>
+            </w:pPr>
+            <w:r>
+              <w:rPr>
+                <w:rFonts w:ascii="Cambria" w:hAnsi="Cambria"/>
+                <w:sz w:val="17"/>
+              </w:rPr>
+              <w:t>Unique physical mediation is not identified.</w:t>
+            </w:r>
+          </w:p>
+        </w:tc>
+      </w:tr>
+    </w:tbl>
+    <w:p>
+      <w:pPr>
+        <w:spacing w:after="20"/>
+      </w:pPr>
+    </w:p>
+    <w:p>
+      <w:r>
+        <w:t>This toy supplies a coherent higher-state construction satisfying the declared operational gates for a restricted synthetic model class. Its equations were stipulated, not derived from historical Level 0 or executed through the canonical five-object successor operator. No natural carrier was tested. In particular, the earlier unfavorable direct-dyad result remains unchanged and cannot be retrospectively converted into a successful comparison.</w:t>
+      </w:r>
+    </w:p>
+    <w:p>
+      <w:pPr>
+        <w:pStyle w:val="Heading1"/>
+      </w:pPr>
+      <w:r>
+        <w:t>12. Formal completion and outstanding claims</w:t>
       </w:r>
     </w:p>
     <w:p>
@@ -2409,7 +2989,7 @@
     </w:p>
     <w:p>
       <w:r>
-        <w:t>Two independent boundaries remain. First, the canonical quadratic neutral completion is explicit in the later BFG corpus, but it is not uniquely entailed by the earliest qualitative Level-0 statements. A Level-0 formation functional can supply a local positive Hessian and thus a local Gram pullback, while its full quartic expansion need not equal the exact quadratic completion at arbitrary displacement [4,5]. Second, no carrier in the current record supplies a prospectively fixed higher channel, selective relation removal, restoration, source-continuity checks, and successful mechanistically distinct rival comparisons. These are obligations for a chosen realization, not missing algebra in Theorem 1.</w:t>
+        <w:t>Two independent boundaries remain. First, the canonical quadratic neutral completion is explicit in the later BFG corpus, but it is not uniquely entailed by the earliest qualitative Level-0 statements. A Level-0 formation functional can supply a local positive Hessian and thus a local Gram pullback, while its full quartic expansion need not equal the exact quadratic completion at arbitrary displacement [4,5]. Second, the constructed witness supplies selective removal, restoration, and restricted comparisons by design, but no natural carrier or unrestricted rival audit has been established. These are obligations for a chosen realization, not missing algebra in Theorem 1.</w:t>
       </w:r>
     </w:p>
     <w:p>
@@ -2421,7 +3001,7 @@
       </w:r>
       <w:r>
         <w:tab/>
-        <w:t>(19)</w:t>
+        <w:t>(20)</w:t>
       </w:r>
     </w:p>
     <w:p>
@@ -2434,7 +3014,7 @@
         <w:pStyle w:val="Heading1"/>
       </w:pPr>
       <w:r>
-        <w:t>12. Conclusion</w:t>
+        <w:t>13. Conclusion</w:t>
       </w:r>
     </w:p>
     <w:p>
@@ -2442,7 +3022,7 @@
         <w:keepLines/>
       </w:pPr>
       <w:r>
-        <w:t>The BFG generator and finite reclosure can be read as complementary layers of one research program. The finite operator constructs candidates, and the generator-level criteria classify their possible higher closure. The neutral-compatible inheritance–novelty identity is exact; the proposed strong emergence criterion additionally requires causal relation necessity and discrimination against genuine rivals. An exact dynamical clone is mathematically indistinguishable from its source representation and belongs in an equivalence class rather than the set of rivals to be defeated. Existing synthetic tests reveal a mediator effect but do not establish the strong claim. Universal formal closure with a precise emergence criterion is achieved; universal emergent realization remains open.</w:t>
+        <w:t>The BFG generator and finite reclosure can be read as complementary layers of one research program. The finite operator constructs candidates, and the generator-level criteria classify their possible higher closure. The neutral-compatible inheritance–novelty identity is exact. A new constructive example satisfies the stated source, higher-state, removal, restoration, and restricted-rival gates, whereas an earlier pilot fails its direct-dyad comparison. An exact dynamical clone ties. This establishes a restricted synthetic possibility within stipulated dynamics, not a unique physical mechanism or the complete canonical BFG emergence claim. Universal formal closure with a precise emergence criterion is integrated; universal emergent realization remains open.</w:t>
       </w:r>
     </w:p>
     <w:p>
@@ -2458,7 +3038,7 @@
         <w:pStyle w:val="CaptionBFG"/>
       </w:pPr>
       <w:r>
-        <w:t>Table 4. Main symbols.</w:t>
+        <w:t>Table 5. Main symbols.</w:t>
       </w:r>
     </w:p>
     <w:tbl>
@@ -2971,7 +3551,7 @@
     </w:p>
     <w:p>
       <w:r>
-        <w:t>The analytical proofs in Sections 4 and 7 require no simulation. The pilot numbers in Section 10 are transcribed from the frozen report [9] and its accompanying executable Python file bfg_relational_ablation_pilot.py, seed 20260929; this paper does not claim a new independent data run. The earlier circular-shift figures are transcribed from [1] and its published numerical supplement. The present Figure 1 is a new explanatory diagram, not data. No natural empirical dataset was analyzed for this manuscript.</w:t>
+        <w:t>The analytical proofs in Sections 4 and 7 require no simulation. The pilot numbers in Section 10 are transcribed from the frozen report [9] and its accompanying executable Python file bfg_relational_ablation_pilot.py, seed 20260929. The new constructive generator and frozen results in Section 11 are reproduced by bfg_constructive_emergence_witness.py under CONSTRUCTIVE_TEST_PROTOCOL.md [12]. This constructed model was selected to exhibit the declared gates and does not constitute independent confirmation. The earlier circular-shift figures are transcribed from [1] and its published numerical supplement. Figure 1 is an explanatory diagram, not data. No natural empirical dataset was analyzed for this manuscript.</w:t>
       </w:r>
     </w:p>
     <w:p>
@@ -3092,6 +3672,15 @@
       </w:pPr>
       <w:r>
         <w:t>[11] R. A. Horn and C. R. Johnson, Matrix Analysis, 2nd ed., Cambridge University Press, 2012, doi:10.1017/CBO9781139020411.</w:t>
+      </w:r>
+    </w:p>
+    <w:p>
+      <w:pPr>
+        <w:spacing w:after="100"/>
+        <w:ind w:left="432" w:hanging="432"/>
+      </w:pPr>
+      <w:r>
+        <w:t>[12] M. T. Wende, “Constructive Synthetic Emergence Witness,” fixed construction protocol, executable Python script and frozen JSON output, accompanying this revised preprint, 29 September 2026.</w:t>
       </w:r>
     </w:p>
     <w:sectPr>

</xml_diff>

<commit_message>
Correct emergence null comparison with matched-memory direct control
</commit_message>
<xml_diff>
--- a/papers/universal-reclosure-emergence-2026-09-29/BFG_Universal_Reclosure_and_Emergence_Preprint_2026-09-29.docx
+++ b/papers/universal-reclosure-emergence-2026-09-29/BFG_Universal_Reclosure_and_Emergence_Preprint_2026-09-29.docx
@@ -102,7 +102,7 @@
     </w:p>
     <w:p>
       <w:r>
-        <w:t>We connect the generator-level BFG grammar of formation, bounded non-vanishing persistence, and relational reclosure to its finite five-object successor representation. A neutral-compatible stratum admits an exact inheritance–novelty identity: commutation of inherited formation with neutral load is equivalent to unchanged formation, while noncommutation produces strict loss of the second spectral moment. This witnesses internal structural novelty, not automatically an irreducible higher closure. We formalize the latter by source continuity, recursive higher closure, generative removal, and specified mechanistic rivals. A representation theorem shows that invertible recoding of a hidden mediator gives identical observed paths. An earlier constructed pilot has a positive removal effect but is outperformed by a direct dyad. We additionally construct a two-stage synthetic example with persistent sources, a separately updated higher state, successful edge removal and restoration, and an exact temporal signature separating declared one-pole and additive rivals. A two-state recoding remains equivalent. Thus a restricted synthetic witness exists, while universal existence, unique mediation, canonical-map realization, and natural-carrier irreducibility remain unproved.</w:t>
+        <w:t>We connect the generator-level BFG grammar of formation, bounded non-vanishing persistence, and relational reclosure to its finite five-object successor representation. A neutral-compatible stratum admits an exact inheritance–novelty identity: commutation of inherited formation with neutral load is equivalent to unchanged formation, while noncommutation produces strict loss of the second spectral moment. This witnesses internal structural novelty, not automatically an irreducible higher closure. We formalize the latter by source continuity, recursive higher closure, generative removal, and specified mechanistic rivals. A representation theorem shows that invertible recoding of a hidden mediator gives identical observed paths. An earlier constructed pilot has a positive removal effect but is outperformed by a direct dyad. We additionally construct a two-stage synthetic example with persistent sources and successful edge removal and restoration. A matched-memory direct source-history model reproduces its complete trajectories and intervention signatures to numerical precision. Its operational synthetic gate passes, while specific mediation exclusion does not. Universal existence, canonical-map realization, and natural-carrier irreducibility remain unproved.</w:t>
       </w:r>
     </w:p>
     <w:p>
@@ -2399,7 +2399,7 @@
         <w:pStyle w:val="Heading1"/>
       </w:pPr>
       <w:r>
-        <w:t>11. A constructive synthetic witness with restricted rivals</w:t>
+        <w:t>11. A constructive synthetic witness and its matched direct control</w:t>
       </w:r>
     </w:p>
     <w:p>
@@ -2426,7 +2426,24 @@
     </w:p>
     <w:p>
       <w:r>
-        <w:t>The same-time mixed contrast q(+,+)−q(+,-)−q(-,+)+q(-,-)=2 excludes the defined additive or interaction-free common-driver controls under independently controlled source assignments. A single-time circular-shift control with shifted history fixed has zero such contrast. The unit impulse response from qₜ to hₜ₊ₖ is (g₁,g₂,g₃,g₄)=(0,0.24,0.24,0.1824), with g₂g₄−g₃²=−0.013824. A direct dyad in the specified one-pole class hₜ₊₁=λhₜ+cqₜ₋₁ has a zero determinant and cannot match all four lags. Its threshold was |determinant|&gt;0.01. An unrestricted direct model with two driven states can reproduce the full trajectory by recoding m and h; this is a representation-equivalence tie, not a defeated rival.</w:t>
+        <w:t>The same-time mixed contrast q(+,+)−q(+,-)−q(-,+)+q(-,-)=2 excludes the specified additive or interaction-free controls under controlled source assignments. A circular shift with its shifted history fixed likewise has zero contrast. The unit impulse response from qₜ to hₜ₊ₖ is (g₁,g₂,g₃,g₄)=(0,0.24,0.24,0.1824), with g₂g₄−g₃²=−0.013824. A one-pole direct dyad hₜ₊₁=λhₜ+cqₜ₋₁ has zero determinant, but lacks the full model’s memory and is not the decisive direct comparison.</w:t>
+      </w:r>
+    </w:p>
+    <w:p>
+      <w:pPr>
+        <w:pStyle w:val="Equation"/>
+      </w:pPr>
+      <w:r>
+        <w:t>rₜ=0.6ᵗ+0.4Σₖ₌₀ᵗ⁻¹0.6ᵗ⁻¹⁻ᵏqₖ,     hₜ₊₁=0.4hₜ+0.6γₜrₜ.</w:t>
+      </w:r>
+      <w:r>
+        <w:tab/>
+        <w:t>(20)</w:t>
+      </w:r>
+    </w:p>
+    <w:p>
+      <w:r>
+        <w:t>The matched-memory direct source-history control (20) contains no explicitly named mediator state, but has the same effective memory and receives the same perturbation, removal, and restoration schedule. It reproduces every observed higher path in all three arms for 1,000 matched trajectories, with maximum absolute error 6.661×10⁻¹⁶. Independent controlled assignments give the same four impulse values and a higher-state mixed contrast 0.48 at lag two. The control therefore passes the signatures and interventions that the constructed system passes. The physical mediation claim is not identified by these observations: r is mathematically the eliminated m. It is an equivalent representation, not a distinct causal explanation proved false. The originally published restricted-rival pass assertion is corrected here and retained in version history [12].</w:t>
       </w:r>
     </w:p>
     <w:p>
@@ -2434,7 +2451,7 @@
         <w:pStyle w:val="CaptionBFG"/>
       </w:pPr>
       <w:r>
-        <w:t>Table 4. Fixed constructive test and logical reach.</w:t>
+        <w:t>Table 4. Corrected constructive test and logical reach.</w:t>
       </w:r>
     </w:p>
     <w:tbl>
@@ -2791,7 +2808,7 @@
                 <w:rFonts w:ascii="Cambria" w:hAnsi="Cambria"/>
                 <w:sz w:val="17"/>
               </w:rPr>
-              <w:t>Restricted rivals</w:t>
+              <w:t>Direct source history</w:t>
             </w:r>
           </w:p>
         </w:tc>
@@ -2824,7 +2841,7 @@
                 <w:rFonts w:ascii="Cambria" w:hAnsi="Cambria"/>
                 <w:sz w:val="17"/>
               </w:rPr>
-              <w:t>Mixed contrast 2; temporal determinant −0.013824.</w:t>
+              <w:t>Paths and intervention signatures tie within 6.661×10⁻¹⁶.</w:t>
             </w:r>
           </w:p>
         </w:tc>
@@ -2857,7 +2874,7 @@
                 <w:rFonts w:ascii="Cambria" w:hAnsi="Cambria"/>
                 <w:sz w:val="17"/>
               </w:rPr>
-              <w:t>Excludes specified additive and one-pole forms only.</w:t>
+              <w:t>Same effective memory; mediation unidentifiable.</w:t>
             </w:r>
           </w:p>
         </w:tc>
@@ -2892,7 +2909,7 @@
                 <w:rFonts w:ascii="Cambria" w:hAnsi="Cambria"/>
                 <w:sz w:val="17"/>
               </w:rPr>
-              <w:t>Two-state clone</w:t>
+              <w:t>One-pole diagnostic</w:t>
             </w:r>
           </w:p>
         </w:tc>
@@ -2925,7 +2942,7 @@
                 <w:rFonts w:ascii="Cambria" w:hAnsi="Cambria"/>
                 <w:sz w:val="17"/>
               </w:rPr>
-              <w:t>Exact representational tie.</w:t>
+              <w:t>Zero determinant versus −0.013824.</w:t>
             </w:r>
           </w:p>
         </w:tc>
@@ -2958,7 +2975,7 @@
                 <w:rFonts w:ascii="Cambria" w:hAnsi="Cambria"/>
                 <w:sz w:val="17"/>
               </w:rPr>
-              <w:t>Unique physical mediation is not identified.</w:t>
+              <w:t>Insufficient memory; not decisive for mediation.</w:t>
             </w:r>
           </w:p>
         </w:tc>
@@ -2971,7 +2988,7 @@
     </w:p>
     <w:p>
       <w:r>
-        <w:t>This toy supplies a coherent higher-state construction satisfying the declared operational gates for a restricted synthetic model class. Its equations were stipulated, not derived from historical Level 0 or executed through the canonical five-object successor operator. No natural carrier was tested. In particular, the earlier unfavorable direct-dyad result remains unchanged and cannot be retrospectively converted into a successful comparison.</w:t>
+        <w:t>This toy supplies a coherent higher-state construction satisfying the declared operational synthetic gates. The specific-mediation exclusion conjunct in (11) is not established by the tied matched-memory direct control. Its equations were stipulated, not derived from historical Level 0 or executed through the canonical five-object successor operator. No natural carrier was tested. The earlier unfavorable direct-dyad result remains unchanged. A selective intervention on an independently measurable physical mediator, beyond the shared input and reported paths here, would be needed for physical identification.</w:t>
       </w:r>
     </w:p>
     <w:p>
@@ -2989,7 +3006,7 @@
     </w:p>
     <w:p>
       <w:r>
-        <w:t>Two independent boundaries remain. First, the canonical quadratic neutral completion is explicit in the later BFG corpus, but it is not uniquely entailed by the earliest qualitative Level-0 statements. A Level-0 formation functional can supply a local positive Hessian and thus a local Gram pullback, while its full quartic expansion need not equal the exact quadratic completion at arbitrary displacement [4,5]. Second, the constructed witness supplies selective removal, restoration, and restricted comparisons by design, but no natural carrier or unrestricted rival audit has been established. These are obligations for a chosen realization, not missing algebra in Theorem 1.</w:t>
+        <w:t>Two independent boundaries remain. First, the canonical quadratic neutral completion is explicit in the later BFG corpus, but it is not uniquely entailed by the earliest qualitative Level-0 statements. A Level-0 formation functional can supply a local positive Hessian and thus a local Gram pullback, while its full quartic expansion need not equal the exact quadratic completion at arbitrary displacement [4,5]. Second, the constructed witness supplies removal and restoration by design, but its matched-memory direct control ties and no natural carrier or unrestricted rival audit has been established. These are obligations for a chosen realization, not missing algebra in Theorem 1.</w:t>
       </w:r>
     </w:p>
     <w:p>
@@ -3001,7 +3018,7 @@
       </w:r>
       <w:r>
         <w:tab/>
-        <w:t>(20)</w:t>
+        <w:t>(21)</w:t>
       </w:r>
     </w:p>
     <w:p>
@@ -3022,7 +3039,7 @@
         <w:keepLines/>
       </w:pPr>
       <w:r>
-        <w:t>The BFG generator and finite reclosure can be read as complementary layers of one research program. The finite operator constructs candidates, and the generator-level criteria classify their possible higher closure. The neutral-compatible inheritance–novelty identity is exact. A new constructive example satisfies the stated source, higher-state, removal, restoration, and restricted-rival gates, whereas an earlier pilot fails its direct-dyad comparison. An exact dynamical clone ties. This establishes a restricted synthetic possibility within stipulated dynamics, not a unique physical mechanism or the complete canonical BFG emergence claim. Universal formal closure with a precise emergence criterion is integrated; universal emergent realization remains open.</w:t>
+        <w:t>The BFG generator and finite reclosure can be read as complementary layers of one research program. The finite operator constructs candidates, and the generator-level criteria classify their possible higher closure. The neutral-compatible inheritance–novelty identity is exact. A new constructive example satisfies operational source, higher-state, removal, and restoration gates, but a fair direct source-history representation ties on all observed signatures and interventions. An earlier pilot also favored a direct dyad on its chosen endpoint. Thus synthetic causal removal is demonstrable within stipulated dynamics, whereas specific physical mediation and the complete canonical BFG emergence claim remain open. Universal formal closure with a precise emergence criterion is integrated; universal emergent realization remains open.</w:t>
       </w:r>
     </w:p>
     <w:p>

</xml_diff>

<commit_message>
Bridge Level-0 formation and neutral completion in tangent geometry
</commit_message>
<xml_diff>
--- a/papers/universal-reclosure-emergence-2026-09-29/BFG_Universal_Reclosure_and_Emergence_Preprint_2026-09-29.docx
+++ b/papers/universal-reclosure-emergence-2026-09-29/BFG_Universal_Reclosure_and_Emergence_Preprint_2026-09-29.docx
@@ -103,6 +103,11 @@
     <w:p>
       <w:r>
         <w:t>We connect the generator-level BFG grammar of formation, bounded non-vanishing persistence, and relational reclosure to its finite five-object successor representation. A neutral-compatible stratum admits an exact inheritance–novelty identity: commutation of inherited formation with neutral load is equivalent to unchanged formation, while noncommutation produces strict loss of the second spectral moment. This witnesses internal structural novelty, not automatically an irreducible higher closure. We formalize the latter by source continuity, recursive higher closure, generative removal, and specified mechanistic rivals. A representation theorem shows that invertible recoding of a hidden mediator gives identical observed paths. An earlier constructed pilot has a positive removal effect but is outperformed by a direct dyad. We additionally construct a two-stage synthetic example with persistent sources and successful edge removal and restoration. A matched-memory direct source-history model reproduces its complete trajectories and intervention signatures to numerical precision. Its operational synthetic gate passes, while specific mediation exclusion does not. Universal existence, canonical-map realization, and natural-carrier irreducibility remain unproved.</w:t>
+      </w:r>
+    </w:p>
+    <w:p>
+      <w:r>
+        <w:t>A Hessian-tangent bridge reconciles the quartic Level-0 formation with exact quadratic neutral elimination: the latter is exact in the explicitly normalized second-order sector, whereas finite-displacement cubic and quartic terms remain in the parent formation energy. This resolves their mathematical compatibility without claiming that Level 0 alone uniquely chooses the neutral-sector rule.</w:t>
       </w:r>
     </w:p>
     <w:p>
@@ -802,6 +807,11 @@
       </w:r>
     </w:p>
     <w:p>
+      <w:r>
+        <w:t>The source places quartic formation in Section 3.1 and quadratic neutral completion in Section 3.2 [13]. Appendix C connects them through the formed branch’s Hessian tangent sector and whitened coordinates. Finite-displacement quartic terms remain; using the tangent sector as neutral mediation is an explicit role identification.</w:t>
+      </w:r>
+    </w:p>
+    <w:p>
       <w:pPr>
         <w:pStyle w:val="Equation"/>
       </w:pPr>
@@ -820,12 +830,13 @@
     </w:p>
     <w:p>
       <w:pPr>
+        <w:keepNext/>
         <w:jc w:val="center"/>
       </w:pPr>
       <w:r>
         <w:drawing>
           <wp:inline xmlns:a="http://schemas.openxmlformats.org/drawingml/2006/main" xmlns:pic="http://schemas.openxmlformats.org/drawingml/2006/picture">
-            <wp:extent cx="6080760" cy="1858010"/>
+            <wp:extent cx="5486400" cy="1676400"/>
             <wp:docPr id="1" name="Picture 1"/>
             <wp:cNvGraphicFramePr>
               <a:graphicFrameLocks noChangeAspect="1"/>
@@ -846,7 +857,7 @@
                   <pic:spPr>
                     <a:xfrm>
                       <a:off x="0" y="0"/>
-                      <a:ext cx="6080760" cy="1858010"/>
+                      <a:ext cx="5486400" cy="1676400"/>
                     </a:xfrm>
                     <a:prstGeom prst="rect"/>
                   </pic:spPr>
@@ -3572,11 +3583,102 @@
       </w:r>
     </w:p>
     <w:p>
+      <w:r>
+        <w:br w:type="page"/>
+      </w:r>
+    </w:p>
+    <w:p>
       <w:pPr>
         <w:pStyle w:val="Heading1"/>
       </w:pPr>
       <w:r>
-        <w:t>Appendix C. Declarations</w:t>
+        <w:t>Appendix C. Level-0 formation to neutral tangent sector</w:t>
+      </w:r>
+    </w:p>
+    <w:p>
+      <w:r>
+        <w:t>The BFG source [13, Section 3.1] gives a real finite-dimensional formed branch F₀(δ)=½⟨δ,K₀δ⟩+¼‖δ‖⁴ with simple lowest eigenvalue λ₀&lt;0 and normalized eigenvector e₀. At δ*=±√(−λ₀)e₀ its Hessian is</w:t>
+      </w:r>
+    </w:p>
+    <w:p>
+      <w:pPr>
+        <w:pStyle w:val="Equation"/>
+      </w:pPr>
+      <w:r>
+        <w:t>H_* = D²F₀(δ*) = K₀−λ₀I−2λ₀e₀e₀† &gt; 0.</w:t>
+      </w:r>
+      <w:r>
+        <w:tab/>
+        <w:t>(22)</w:t>
+      </w:r>
+    </w:p>
+    <w:p>
+      <w:r>
+        <w:t>Along e₀ its eigenvalue is −2λ₀; on every perpendicular eigenmode eⱼ it is λⱼ−λ₀&gt;0. Define the exact quadratic tangent form Q*(x)=½⟨x,H_*x⟩. Taylor’s theorem gives F₀(δ*+x)−F₀(δ*)=Q*(x)+O(‖x‖³), so equality to the quartic parent energy at finite displacement is not claimed.</w:t>
+      </w:r>
+    </w:p>
+    <w:p>
+      <w:r>
+        <w:t>Let D be a perturbation of this branch, let L map a neutral perturbation η to the source perturbation carrier, and let M&gt;0 be the stated neutral-channel metric. The first metric H_* is computed from Level 0; M and the two-piece mediation role must be identified for the chosen carrier. The tangent neutral completion is</w:t>
+      </w:r>
+    </w:p>
+    <w:p>
+      <w:pPr>
+        <w:pStyle w:val="Equation"/>
+      </w:pPr>
+      <w:r>
+        <w:t>Jtan(D,η) = ½⟨D−Lη,H*(D−Lη)⟩ + ½⟨η,Mη⟩.</w:t>
+      </w:r>
+      <w:r>
+        <w:tab/>
+        <w:t>(23)</w:t>
+      </w:r>
+    </w:p>
+    <w:p>
+      <w:r>
+        <w:t>Write H½ and M½ for the positive square roots of H* and M. Set d=H½D, ν=M½η, and A†=H½L(M½)⁻¹. These are invertible coordinate changes in the declared quadratic sector; therefore (23) is precisely the published canonical functional (5) in normalized coordinates. In particular:</w:t>
+      </w:r>
+    </w:p>
+    <w:p>
+      <w:pPr>
+        <w:pStyle w:val="Equation"/>
+      </w:pPr>
+      <w:r>
+        <w:t>Y=A†A=H½LM⁻¹L†H½;    min Jtan=½⟨D,H½(I+Y)⁻¹H½D⟩.</w:t>
+      </w:r>
+      <w:r>
+        <w:tab/>
+        <w:t>(24)</w:t>
+      </w:r>
+    </w:p>
+    <w:p>
+      <w:r>
+        <w:t>For the scalar Level-0 branch K₀=−1 and δ*=1, H*=2. If L=I and the neutral piece is the same formed branch (M=2), then d=√2D, A†=I, Y=I, and min Jtan=D²/2=d²/4. This agrees with the quadratic part of the exact quartic two-piece minimum. Indeed f(z):=F₀(1+z)−F₀(1)=z²+z³+z⁴/4 and, for D≥0, the unique global minimum of f(D−η)+f(η) is</w:t>
+      </w:r>
+    </w:p>
+    <w:p>
+      <w:pPr>
+        <w:pStyle w:val="Equation"/>
+      </w:pPr>
+      <w:r>
+        <w:t>2f(D/2)=D²/2+D³/4+D⁴/32.</w:t>
+      </w:r>
+      <w:r>
+        <w:tab/>
+        <w:t>(25)</w:t>
+      </w:r>
+    </w:p>
+    <w:p>
+      <w:r>
+        <w:t>To verify global minimality, write η=D/2+t and z=D/2. Then f(z+t)+f(z−t)−2f(z)=t²(2+6z+3z²)+t⁴/2&gt;0 for t≠0 and z≥0. Equations (23)–(24) are exact throughout the *quadratic tangent model*; equation (25) records the finite-displacement remainder of the full Level-0 formation. Thus Sections 3.1 and 3.2 are mathematically compatible with an explicit tangent-sector and whitening convention. The role choice and any distinct neutral metric M are not uniquely derived from Section 3.1 alone.</w:t>
+      </w:r>
+    </w:p>
+    <w:p>
+      <w:pPr>
+        <w:pStyle w:val="Heading1"/>
+      </w:pPr>
+      <w:r>
+        <w:t>Appendix D. Declarations</w:t>
       </w:r>
     </w:p>
     <w:p>
@@ -3698,6 +3800,15 @@
       </w:pPr>
       <w:r>
         <w:t>[12] M. T. Wende, “Constructive Synthetic Emergence Witness,” fixed construction protocol, executable Python script and frozen JSON output, accompanying this revised preprint, 29 September 2026.</w:t>
+      </w:r>
+    </w:p>
+    <w:p>
+      <w:pPr>
+        <w:spacing w:after="100"/>
+        <w:ind w:left="432" w:hanging="432"/>
+      </w:pPr>
+      <w:r>
+        <w:t>[13] M. T. Wende, “The BFG Strong Universal Reclosure Equation: A Self-Closed Mathematical Architecture from Level-0 Formation to Domain-Independent Closure Classes and Natural-System Realization,” BFG whitepaper, 8 September 2026, Sections 3.1–3.2.</w:t>
       </w:r>
     </w:p>
     <w:sectPr>

</xml_diff>

<commit_message>
Restate BFG derivation from Level 0 and subsequent neutral rule
</commit_message>
<xml_diff>
--- a/papers/universal-reclosure-emergence-2026-09-29/BFG_Universal_Reclosure_and_Emergence_Preprint_2026-09-29.docx
+++ b/papers/universal-reclosure-emergence-2026-09-29/BFG_Universal_Reclosure_and_Emergence_Preprint_2026-09-29.docx
@@ -107,7 +107,7 @@
     </w:p>
     <w:p>
       <w:r>
-        <w:t>A Hessian-tangent bridge reconciles the quartic Level-0 formation with exact quadratic neutral elimination: the latter is exact in the explicitly normalized second-order sector, whereas finite-displacement cubic and quartic terms remain in the parent formation energy. This resolves their mathematical compatibility without claiming that Level 0 alone uniquely chooses the neutral-sector rule.</w:t>
+        <w:t>The derivation is BFG-internal in the precise sense that it uses Level-0 formation together with the subsequently stated BFG neutral-completion rule. The formed branch supplies a positive Hessian; an explicit interface identifies its quadratic tangent coordinate with the neutral rule’s normalized source coordinate. Neutral elimination and the Gram load then follow exactly in that sector. Level 0 alone does not uniquely select the neutral rule, and the quartic energy retains higher-order terms at finite displacement.</w:t>
       </w:r>
     </w:p>
     <w:p>
@@ -808,7 +808,7 @@
     </w:p>
     <w:p>
       <w:r>
-        <w:t>The source places quartic formation in Section 3.1 and quadratic neutral completion in Section 3.2 [13]. Appendix C connects them through the formed branch’s Hessian tangent sector and whitened coordinates. Finite-displacement quartic terms remain; using the tangent sector as neutral mediation is an explicit role identification.</w:t>
+        <w:t>The BFG source states quartic formation in Section 3.1 and then the quadratic neutral-completion rule in Section 3.2 [13]. Appendix C sets out the dependency chain: §3.1 implies a positive formed-branch Hessian; §3.2 supplies the two-piece neutral rule; an explicit carrier identification and whitening align their coordinates; exact minimization gives the resolvent and Gram load. Finite-displacement quartic terms remain, and the carrier identification is not uniquely derived from §3.1.</w:t>
       </w:r>
     </w:p>
     <w:p>
@@ -3017,7 +3017,7 @@
     </w:p>
     <w:p>
       <w:r>
-        <w:t>Two independent boundaries remain. First, the canonical quadratic neutral completion is explicit in the later BFG corpus, but it is not uniquely entailed by the earliest qualitative Level-0 statements. A Level-0 formation functional can supply a local positive Hessian and thus a local Gram pullback, while its full quartic expansion need not equal the exact quadratic completion at arbitrary displacement [4,5]. Second, the constructed witness supplies removal and restoration by design, but its matched-memory direct control ties and no natural carrier or unrestricted rival audit has been established. These are obligations for a chosen realization, not missing algebra in Theorem 1.</w:t>
+        <w:t>Two independent boundaries remain. First, the BFG-internal chain uses the Level-0 formation rule and the subsequently stated quadratic neutral rule together; the latter is not uniquely entailed by §3.1 alone. The formed-branch Hessian supplies a local geometry, but its quartic parent energy does not equal the quadratic completion at arbitrary displacement [4,5,13]. The identification of the neutral carrier must be specified. Second, the constructed witness supplies removal and restoration by design, but its matched-memory direct control ties and no natural carrier or unrestricted rival audit has been established. These are obligations for a chosen realization, not missing algebra in Theorem 1.</w:t>
       </w:r>
     </w:p>
     <w:p>
@@ -3592,7 +3592,12 @@
         <w:pStyle w:val="Heading1"/>
       </w:pPr>
       <w:r>
-        <w:t>Appendix C. Level-0 formation to neutral tangent sector</w:t>
+        <w:t>Appendix C. BFG-internal dependency chain from Level 0 to neutral completion</w:t>
+      </w:r>
+    </w:p>
+    <w:p>
+      <w:r>
+        <w:t>This chain uses the BFG rules in their printed order: §3.1 declares quartic formation; its second variation gives the formed-branch tangent geometry; §3.2 separately declares the two-piece quadratic neutral functional. The interface identifies its normalized source variable with a tangent perturbation of that formed branch. Once the interface is declared, elimination and the Gram load are consequences. No claim is made that §3.1 alone uniquely determines §3.2 or a physical mediator.</w:t>
       </w:r>
     </w:p>
     <w:p>
@@ -3619,7 +3624,7 @@
     </w:p>
     <w:p>
       <w:r>
-        <w:t>Let D be a perturbation of this branch, let L map a neutral perturbation η to the source perturbation carrier, and let M&gt;0 be the stated neutral-channel metric. The first metric H_* is computed from Level 0; M and the two-piece mediation role must be identified for the chosen carrier. The tangent neutral completion is</w:t>
+        <w:t>Section 3.2 supplies the canonical BFG two-piece rule (5). Let D be a perturbation of this branch, let L map a neutral perturbation η to the source perturbation carrier, and let M&gt;0 be the identified neutral-channel metric. The first metric H* is computed from Level 0; M and the carrier correspondence must be identified in an application. In unnormalized tangent coordinates the §3.2 rule reads</w:t>
       </w:r>
     </w:p>
     <w:p>
@@ -3636,7 +3641,7 @@
     </w:p>
     <w:p>
       <w:r>
-        <w:t>Write H½ and M½ for the positive square roots of H* and M. Set d=H½D, ν=M½η, and A†=H½L(M½)⁻¹. These are invertible coordinate changes in the declared quadratic sector; therefore (23) is precisely the published canonical functional (5) in normalized coordinates. In particular:</w:t>
+        <w:t>Write H½ and M½ for the positive square roots of H* and M. Set d=H½D, ν=M½η, and A†=H½L(M½)⁻¹. These are invertible coordinate changes in the declared quadratic sector; therefore (23) is precisely the published canonical functional (5) in normalized coordinates. Conversely any specified A† can be represented in this chart by L=(H½)⁻¹A†M½. This representation does not select a unique physical coupling. Exact minimization gives</w:t>
       </w:r>
     </w:p>
     <w:p>
@@ -3670,7 +3675,7 @@
     </w:p>
     <w:p>
       <w:r>
-        <w:t>To verify global minimality, write η=D/2+t and z=D/2. Then f(z+t)+f(z−t)−2f(z)=t²(2+6z+3z²)+t⁴/2&gt;0 for t≠0 and z≥0. Equations (23)–(24) are exact throughout the *quadratic tangent model*; equation (25) records the finite-displacement remainder of the full Level-0 formation. Thus Sections 3.1 and 3.2 are mathematically compatible with an explicit tangent-sector and whitening convention. The role choice and any distinct neutral metric M are not uniquely derived from Section 3.1 alone.</w:t>
+        <w:t>To verify global minimality, write η=D/2+t and z=D/2. Then f(z+t)+f(z−t)−2f(z)=t²(2+6z+3z²)+t⁴/2&gt;0 for t≠0 and z≥0. Equations (23)–(24) are exact throughout the *quadratic tangent model*; equation (25) records the finite-displacement remainder of the full Level-0 formation. Thus the internally stated BFG rules §3.1 and §3.2 can be combined into a consistent calculation under the displayed interface. This is a deduction from both rules, not a derivation of the latter from §3.1 alone.</w:t>
       </w:r>
     </w:p>
     <w:p>

</xml_diff>

<commit_message>
Specify measurable full BFG state and selective natural-carrier protocol
</commit_message>
<xml_diff>
--- a/papers/universal-reclosure-emergence-2026-09-29/BFG_Universal_Reclosure_and_Emergence_Preprint_2026-09-29.docx
+++ b/papers/universal-reclosure-emergence-2026-09-29/BFG_Universal_Reclosure_and_Emergence_Preprint_2026-09-29.docx
@@ -3679,6 +3679,11 @@
       </w:r>
     </w:p>
     <w:p>
+      <w:r>
+        <w:br w:type="page"/>
+      </w:r>
+    </w:p>
+    <w:p>
       <w:pPr>
         <w:pStyle w:val="Heading1"/>
       </w:pPr>
@@ -3689,6 +3694,24 @@
     <w:p>
       <w:r>
         <w:t>Author and corresponding author: Marcel Theodor Wende, BalanceFeld Gleichung (BFG), Independent Researcher; marcel-wende@gmx.net; ORCID 0009-0007-4028-2208. Conceptualization, BFG source development, interpretation, and responsibility for the claims: Marcel Theodor Wende. Co-authored precursor works retain their own credited authorship in the references. No human or animal subjects were involved. No external funding or competing-interest assertion is made here; submission-specific disclosures should be confirmed by the author. AI-assisted preparation was used for source consolidation, mathematical cross-checking, English drafting, diagram and document production; scientific responsibility rests with the author.</w:t>
+      </w:r>
+    </w:p>
+    <w:p>
+      <w:pPr>
+        <w:pStyle w:val="Heading1"/>
+      </w:pPr>
+      <w:r>
+        <w:t>Appendix E. Natural-carrier measurement and selective intervention</w:t>
+      </w:r>
+    </w:p>
+    <w:p>
+      <w:r>
+        <w:t>A prospective physical realization must first fix an experimentally identifiable map into every full-state entry: the three capacities (whose measured combination is K), a nonzero formation density, a separate unit-trace identity witness, the neutral response A and source metric giving Y=A†A, and a measured recursive response R_C. A fixed carrier, calibration, uncertainty model and admissibility gate must apply in all intervention arms. K alone does not identify its three capacities, and a chosen positive matrix is not by itself a measurement. The full protocol accompanying this preprint [15] records the required measurements and explicit failure outcomes.</w:t>
+      </w:r>
+    </w:p>
+    <w:p>
+      <w:r>
+        <w:t>A controllable electronic three-oscillator dataset [14] varies pairwise and three-body couplings independently and measures six oscillator voltages. It is a promising exploratory carrier, but those voltages do not provide an independent higher reporter or a complete BFG state map; coupling sweeps are not a prospectively paired removal and restoration test. A new acquisition must instrument the proposed mediator and a separately evolving downstream higher channel, disable the actual generating coupling while preserving source closure, restore the same coupling at fixed parameters, and compare mechanistically different rivals with matched effective memory. Computed synchronization of the same source voltages cannot serve as an independent reporter. Until such measured arms and fixed mappings exist, natural irreducible emergence remains unproved.</w:t>
       </w:r>
     </w:p>
     <w:p>
@@ -3814,6 +3837,24 @@
       </w:pPr>
       <w:r>
         <w:t>[13] M. T. Wende, “The BFG Strong Universal Reclosure Equation: A Self-Closed Mathematical Architecture from Level-0 Formation to Domain-Independent Closure Classes and Natural-System Realization,” BFG whitepaper, 8 September 2026, Sections 3.1–3.2.</w:t>
+      </w:r>
+    </w:p>
+    <w:p>
+      <w:pPr>
+        <w:spacing w:after="100"/>
+        <w:ind w:left="432" w:hanging="432"/>
+      </w:pPr>
+      <w:r>
+        <w:t>[14] V. P. Vera-Ávila et al., “Experimental datasets on synchronization in simplicial complexes,” Data in Brief 57 (2024) 111145, doi:10.1016/j.dib.2024.111145; Dataset I, doi:10.5281/zenodo.10408252.</w:t>
+      </w:r>
+    </w:p>
+    <w:p>
+      <w:pPr>
+        <w:spacing w:after="100"/>
+        <w:ind w:left="432" w:hanging="432"/>
+      </w:pPr>
+      <w:r>
+        <w:t>[15] M. T. Wende, “Natural-carrier full-state and selective-intervention protocol,” research supplement accompanying this preprint, 29 September 2026.</w:t>
       </w:r>
     </w:p>
     <w:sectPr>

</xml_diff>